<commit_message>
Audit headlines article: fix Zyppy length figures, add formulas section, Google rewrite causes, unique FAQs; update images
Co-Authored-By: Claude Opus 5.5 <noreply@anthropic.com>
Claude-Session: https://claude.ai/code/session_01GQXcnZLn4f9MkUS7SEqp5J
</commit_message>
<xml_diff>
--- a/blog-content/How-To-Write-Blog-Headlines.docx
+++ b/blog-content/How-To-Write-Blog-Headlines.docx
@@ -153,7 +153,7 @@
         </w:rPr>
         <w:t xml:space="preserve">For this guide, I turned that habit into data. I collected 69 ranking titles across 9 blogging, SEO and marketing searches and counted what they share. Below you'll find those patterns, what SEO studies say about length, numbers and title rewrites, and a </w:t>
       </w:r>
-      <w:hyperlink w:history="1" r:id="rIdfhxaop2jgynbes_x8xini">
+      <w:hyperlink w:history="1" r:id="rIdvzc8wvtobuku-5la0qgmh">
         <w:r>
           <w:rPr>
             <w:rStyle w:val="Hyperlink"/>
@@ -204,7 +204,7 @@
           <w:sz w:val="24"/>
           <w:szCs w:val="24"/>
         </w:rPr>
-        <w:t xml:space="preserve">A good blog headline does four jobs in under 60 characters: it matches what the searcher wants, contains the keyword they typed, makes a specific promise, and keeps that promise in the article. Miss any one and the click either never happens or turns into a quick exit.</w:t>
+        <w:t xml:space="preserve">A good blog headline matches what the searcher wants, contains the keyword they typed, makes a specific promise, and describes an article that keeps that promise. It does all of that in about 60 characters. Miss any one and the click either never happens or turns into a quick exit.</w:t>
       </w:r>
     </w:p>
     <w:p>
@@ -322,7 +322,7 @@
         </w:rPr>
         <w:t xml:space="preserve"> Google's own </w:t>
       </w:r>
-      <w:hyperlink w:history="1" r:id="rIdlpjwuznfyicdunaonnj-p">
+      <w:hyperlink w:history="1" r:id="rIdq9nr52neafnmuanyru_gh">
         <w:r>
           <w:rPr>
             <w:rStyle w:val="Hyperlink"/>
@@ -373,7 +373,7 @@
           <w:sz w:val="24"/>
           <w:szCs w:val="24"/>
         </w:rPr>
-        <w:t xml:space="preserve">Search the keyword, then read the titles of the top 10 results before you write anything. The pattern they share is the format Google has tested on real searchers. Your headline should follow that format and then stand out through its angle.</w:t>
+        <w:t xml:space="preserve">Search the keyword, then read the titles of the top 10 results before you write anything. The pattern they share is the format Google currently rewards for that search. Your headline should follow that format and then stand out through its angle.</w:t>
       </w:r>
     </w:p>
     <w:p>
@@ -389,7 +389,7 @@
         </w:rPr>
         <w:t xml:space="preserve">Ahrefs calls this the </w:t>
       </w:r>
-      <w:hyperlink w:history="1" r:id="rIdxtg4vz9yag9uuwt74ip_s">
+      <w:hyperlink w:history="1" r:id="rIdrtgnlgyretz44tcrrx2m0">
         <w:r>
           <w:rPr>
             <w:rStyle w:val="Hyperlink"/>
@@ -613,7 +613,7 @@
           <w:sz w:val="24"/>
           <w:szCs w:val="24"/>
         </w:rPr>
-        <w:t xml:space="preserve">Aim for 6–12 words and 40–60 characters for a blog title that shows in Google. Most titles longer than 60 characters get cut off or rewritten, and very short ones don't carry enough detail to win the click.</w:t>
+        <w:t xml:space="preserve">Aim for 6–12 words and 40–60 characters for a blog title that shows in Google. Longer titles usually get cut off or rewritten, and very short ones don't carry enough detail to win the click.</w:t>
       </w:r>
     </w:p>
     <w:p>
@@ -658,7 +658,7 @@
         </w:rPr>
         <w:t xml:space="preserve"> of about 4 million Google results found that </w:t>
       </w:r>
-      <w:hyperlink w:history="1" r:id="rIderqocf1mdp8e-p68mtrog">
+      <w:hyperlink w:history="1" r:id="rIddgop-j_w9lhuosuyxsmcu">
         <w:r>
           <w:rPr>
             <w:rStyle w:val="Hyperlink"/>
@@ -709,7 +709,7 @@
         </w:rPr>
         <w:t xml:space="preserve"> across 2,370 sites found that </w:t>
       </w:r>
-      <w:hyperlink w:history="1" r:id="rIddcmoh4pdimuyvketfoscm">
+      <w:hyperlink w:history="1" r:id="rId9614zdkbbyvatukjdnwcl">
         <w:r>
           <w:rPr>
             <w:rStyle w:val="Hyperlink"/>
@@ -729,7 +729,7 @@
           <w:sz w:val="24"/>
           <w:szCs w:val="24"/>
         </w:rPr>
-        <w:t xml:space="preserve">, 39–42% of the time. Very long and very short titles were rewritten over 95% of the time.</w:t>
+        <w:t xml:space="preserve">, 39–42% of the time. Titles over 70 characters were rewritten 99.9% of the time.</w:t>
       </w:r>
     </w:p>
     <w:p>
@@ -758,7 +758,7 @@
           <w:sz w:val="24"/>
           <w:szCs w:val="24"/>
         </w:rPr>
-        <w:t xml:space="preserve"> had a median length of 55 characters and 9 words, not counting the brand name. 68% were 60 characters or fewer.</w:t>
+        <w:t xml:space="preserve"> had a median length of 55 characters including any brand name, and 9 words without it. 68% were 60 characters or fewer.</w:t>
       </w:r>
     </w:p>
     <w:p>
@@ -832,7 +832,7 @@
         </w:rPr>
         <w:t xml:space="preserve">Social media is different. BuzzSumo's </w:t>
       </w:r>
-      <w:hyperlink w:history="1" r:id="rId7uim_0aqvgdkyzowa6e1w">
+      <w:hyperlink w:history="1" r:id="rIdqo9vfz1epi4s5fwesg8m-">
         <w:r>
           <w:rPr>
             <w:rStyle w:val="Hyperlink"/>
@@ -971,7 +971,7 @@
         </w:rPr>
         <w:t xml:space="preserve"> BuzzSumo found </w:t>
       </w:r>
-      <w:hyperlink w:history="1" r:id="rId1-y6hh2v8fidsqm_6glso">
+      <w:hyperlink w:history="1" r:id="rIdkqh9fakqcumb-p8zy9ng6">
         <w:r>
           <w:rPr>
             <w:rStyle w:val="Hyperlink"/>
@@ -1110,7 +1110,7 @@
         </w:rPr>
         <w:t xml:space="preserve"> Backlinko found </w:t>
       </w:r>
-      <w:hyperlink w:history="1" r:id="rIdsbjtjt54rxxjhuz7zhz97">
+      <w:hyperlink w:history="1" r:id="rIde8gqb2msdavlxpf-4jelz">
         <w:r>
           <w:rPr>
             <w:rStyle w:val="Hyperlink"/>
@@ -1233,9 +1233,9 @@
           <w:sz w:val="24"/>
           <w:szCs w:val="24"/>
         </w:rPr>
-        <w:t xml:space="preserve">Google rewrites a title when it judges that the title tag doesn't describe the page well for that search. It can pull a replacement from your H1, other headings, anchor text from links to the page, or `og:title`. Google lists all of these in its </w:t>
-      </w:r>
-      <w:hyperlink w:history="1" r:id="rIdg9whjmubi7shtegszpudc">
+        <w:t xml:space="preserve">Google rewrites a title when the title tag doesn't describe the page well. Its </w:t>
+      </w:r>
+      <w:hyperlink w:history="1" r:id="rIdqqbeuufmfzdjpg3kqjnxl">
         <w:r>
           <w:rPr>
             <w:rStyle w:val="Hyperlink"/>
@@ -1255,7 +1255,7 @@
           <w:sz w:val="24"/>
           <w:szCs w:val="24"/>
         </w:rPr>
-        <w:t xml:space="preserve">, last updated in December 2025.</w:t>
+        <w:t xml:space="preserve">, last updated in December 2025, names the usual causes: half-empty titles, outdated ones (such as an old year), inaccurate ones, repeated boilerplate across pages, and pages with no clear main heading. The replacement can come from your H1, other headings, `og:title` or the anchor text of links pointing to the page.</w:t>
       </w:r>
     </w:p>
     <w:p>
@@ -1271,7 +1271,7 @@
         </w:rPr>
         <w:t xml:space="preserve">It happens a lot. Zyppy found Google </w:t>
       </w:r>
-      <w:hyperlink w:history="1" r:id="rIdbabkhuneidvkxkzfvx3sc">
+      <w:hyperlink w:history="1" r:id="rIdfjgtjfekgt9b00ax_p-3v">
         <w:r>
           <w:rPr>
             <w:rStyle w:val="Hyperlink"/>
@@ -1400,7 +1400,7 @@
                 <w:sz w:val="24"/>
                 <w:szCs w:val="24"/>
               </w:rPr>
-              <w:t xml:space="preserve">Rewritten over 95% of the time</w:t>
+              <w:t xml:space="preserve">Over 76% chance of a rewrite (99.9% past 70)</w:t>
             </w:r>
           </w:p>
         </w:tc>
@@ -1417,6 +1417,56 @@
                 <w:szCs w:val="24"/>
               </w:rPr>
               <w:t xml:space="preserve">Keep to 51–60 characters</w:t>
+            </w:r>
+          </w:p>
+        </w:tc>
+      </w:tr>
+      <w:tr>
+        <w:tc>
+          <w:tcPr>
+            <w:tcW w:type="dxa" w:w="1800"/>
+          </w:tcPr>
+          <w:p>
+            <w:r>
+              <w:rPr>
+                <w:rFonts w:ascii="Calibri" w:cs="Calibri" w:eastAsia="Calibri" w:hAnsi="Calibri"/>
+                <w:color w:val="333333"/>
+                <w:sz w:val="24"/>
+                <w:szCs w:val="24"/>
+              </w:rPr>
+              <w:t xml:space="preserve">20 characters or fewer</w:t>
+            </w:r>
+          </w:p>
+        </w:tc>
+        <w:tc>
+          <w:tcPr>
+            <w:tcW w:type="dxa" w:w="1800"/>
+          </w:tcPr>
+          <w:p>
+            <w:r>
+              <w:rPr>
+                <w:rFonts w:ascii="Calibri" w:cs="Calibri" w:eastAsia="Calibri" w:hAnsi="Calibri"/>
+                <w:color w:val="333333"/>
+                <w:sz w:val="24"/>
+                <w:szCs w:val="24"/>
+              </w:rPr>
+              <w:t xml:space="preserve">Over 50% chance of a rewrite</w:t>
+            </w:r>
+          </w:p>
+        </w:tc>
+        <w:tc>
+          <w:tcPr>
+            <w:tcW w:type="dxa" w:w="1800"/>
+          </w:tcPr>
+          <w:p>
+            <w:r>
+              <w:rPr>
+                <w:rFonts w:ascii="Calibri" w:cs="Calibri" w:eastAsia="Calibri" w:hAnsi="Calibri"/>
+                <w:color w:val="333333"/>
+                <w:sz w:val="24"/>
+                <w:szCs w:val="24"/>
+              </w:rPr>
+              <w:t xml:space="preserve">Add the benefit or detail</w:t>
             </w:r>
           </w:p>
         </w:tc>
@@ -1642,7 +1692,7 @@
         </w:rPr>
         <w:t xml:space="preserve">That table settles a debate I see in many headline guides. HubSpot cites research on 3.3 million paid headlines where </w:t>
       </w:r>
-      <w:hyperlink w:history="1" r:id="rIdaupsl_1cpibv7pp0wefhf">
+      <w:hyperlink w:history="1" r:id="rId7u_i7yd2jwzqq80aze0ol">
         <w:r>
           <w:rPr>
             <w:rStyle w:val="Hyperlink"/>
@@ -1678,7 +1728,7 @@
         </w:rPr>
         <w:t xml:space="preserve">A newer factor: in March 2026, Google </w:t>
       </w:r>
-      <w:hyperlink w:history="1" r:id="rIdblx6xdnla1wuy4cluzymv">
+      <w:hyperlink w:history="1" r:id="rIdmk2zt4ripy4eq3pwgssih">
         <w:r>
           <w:rPr>
             <w:rStyle w:val="Hyperlink"/>
@@ -1715,6 +1765,429 @@
           <w:sz w:val="36"/>
           <w:szCs w:val="36"/>
         </w:rPr>
+        <w:t xml:space="preserve">Which headline formulas work for blog posts?</w:t>
+      </w:r>
+    </w:p>
+    <w:p>
+      <w:pPr>
+        <w:spacing w:after="160"/>
+      </w:pPr>
+      <w:r>
+        <w:rPr>
+          <w:rFonts w:ascii="Calibri" w:cs="Calibri" w:eastAsia="Calibri" w:hAnsi="Calibri"/>
+          <w:color w:val="333333"/>
+          <w:sz w:val="24"/>
+          <w:szCs w:val="24"/>
+        </w:rPr>
+        <w:t xml:space="preserve">The best headline formula is the one that matches the format already ranking for your keyword. These five cover almost every blog search. Fill the brackets with your own keyword, number and benefit:</w:t>
+      </w:r>
+    </w:p>
+    <w:tbl>
+      <w:tblPr>
+        <w:tblW w:type="pct" w:w="100%"/>
+        <w:tblBorders>
+          <w:top w:val="single" w:color="auto" w:sz="4"/>
+          <w:left w:val="single" w:color="auto" w:sz="4"/>
+          <w:bottom w:val="single" w:color="auto" w:sz="4"/>
+          <w:right w:val="single" w:color="auto" w:sz="4"/>
+          <w:insideH w:val="single" w:color="auto" w:sz="4"/>
+          <w:insideV w:val="single" w:color="auto" w:sz="4"/>
+        </w:tblBorders>
+      </w:tblPr>
+      <w:tblGrid>
+        <w:gridCol w:w="100"/>
+        <w:gridCol w:w="100"/>
+        <w:gridCol w:w="100"/>
+      </w:tblGrid>
+      <w:tr>
+        <w:tc>
+          <w:tcPr>
+            <w:tcW w:type="dxa" w:w="1800"/>
+            <w:shd w:fill="F0ECFF" w:val="clear"/>
+          </w:tcPr>
+          <w:p>
+            <w:r>
+              <w:rPr>
+                <w:rFonts w:ascii="Calibri" w:cs="Calibri" w:eastAsia="Calibri" w:hAnsi="Calibri"/>
+                <w:b/>
+                <w:bCs/>
+                <w:color w:val="1A1A2E"/>
+                <w:sz w:val="24"/>
+                <w:szCs w:val="24"/>
+              </w:rPr>
+              <w:t xml:space="preserve">Search intent</w:t>
+            </w:r>
+          </w:p>
+        </w:tc>
+        <w:tc>
+          <w:tcPr>
+            <w:tcW w:type="dxa" w:w="1800"/>
+            <w:shd w:fill="F0ECFF" w:val="clear"/>
+          </w:tcPr>
+          <w:p>
+            <w:r>
+              <w:rPr>
+                <w:rFonts w:ascii="Calibri" w:cs="Calibri" w:eastAsia="Calibri" w:hAnsi="Calibri"/>
+                <w:b/>
+                <w:bCs/>
+                <w:color w:val="1A1A2E"/>
+                <w:sz w:val="24"/>
+                <w:szCs w:val="24"/>
+              </w:rPr>
+              <w:t xml:space="preserve">Formula</w:t>
+            </w:r>
+          </w:p>
+        </w:tc>
+        <w:tc>
+          <w:tcPr>
+            <w:tcW w:type="dxa" w:w="1800"/>
+            <w:shd w:fill="F0ECFF" w:val="clear"/>
+          </w:tcPr>
+          <w:p>
+            <w:r>
+              <w:rPr>
+                <w:rFonts w:ascii="Calibri" w:cs="Calibri" w:eastAsia="Calibri" w:hAnsi="Calibri"/>
+                <w:b/>
+                <w:bCs/>
+                <w:color w:val="1A1A2E"/>
+                <w:sz w:val="24"/>
+                <w:szCs w:val="24"/>
+              </w:rPr>
+              <w:t xml:space="preserve">Example</w:t>
+            </w:r>
+          </w:p>
+        </w:tc>
+      </w:tr>
+      <w:tr>
+        <w:tc>
+          <w:tcPr>
+            <w:tcW w:type="dxa" w:w="1800"/>
+          </w:tcPr>
+          <w:p>
+            <w:r>
+              <w:rPr>
+                <w:rFonts w:ascii="Calibri" w:cs="Calibri" w:eastAsia="Calibri" w:hAnsi="Calibri"/>
+                <w:color w:val="333333"/>
+                <w:sz w:val="24"/>
+                <w:szCs w:val="24"/>
+              </w:rPr>
+              <w:t xml:space="preserve">Learn a process</w:t>
+            </w:r>
+          </w:p>
+        </w:tc>
+        <w:tc>
+          <w:tcPr>
+            <w:tcW w:type="dxa" w:w="1800"/>
+          </w:tcPr>
+          <w:p>
+            <w:r>
+              <w:rPr>
+                <w:rFonts w:ascii="Calibri" w:cs="Calibri" w:eastAsia="Calibri" w:hAnsi="Calibri"/>
+                <w:color w:val="333333"/>
+                <w:sz w:val="24"/>
+                <w:szCs w:val="24"/>
+              </w:rPr>
+              <w:t xml:space="preserve">How to [outcome] (without [pain])</w:t>
+            </w:r>
+          </w:p>
+        </w:tc>
+        <w:tc>
+          <w:tcPr>
+            <w:tcW w:type="dxa" w:w="1800"/>
+          </w:tcPr>
+          <w:p>
+            <w:r>
+              <w:rPr>
+                <w:rFonts w:ascii="Calibri" w:cs="Calibri" w:eastAsia="Calibri" w:hAnsi="Calibri"/>
+                <w:color w:val="333333"/>
+                <w:sz w:val="24"/>
+                <w:szCs w:val="24"/>
+              </w:rPr>
+              <w:t xml:space="preserve">How to Start a Blog Without Paying for Hosting</w:t>
+            </w:r>
+          </w:p>
+        </w:tc>
+      </w:tr>
+      <w:tr>
+        <w:tc>
+          <w:tcPr>
+            <w:tcW w:type="dxa" w:w="1800"/>
+          </w:tcPr>
+          <w:p>
+            <w:r>
+              <w:rPr>
+                <w:rFonts w:ascii="Calibri" w:cs="Calibri" w:eastAsia="Calibri" w:hAnsi="Calibri"/>
+                <w:color w:val="333333"/>
+                <w:sz w:val="24"/>
+                <w:szCs w:val="24"/>
+              </w:rPr>
+              <w:t xml:space="preserve">Compare options</w:t>
+            </w:r>
+          </w:p>
+        </w:tc>
+        <w:tc>
+          <w:tcPr>
+            <w:tcW w:type="dxa" w:w="1800"/>
+          </w:tcPr>
+          <w:p>
+            <w:r>
+              <w:rPr>
+                <w:rFonts w:ascii="Calibri" w:cs="Calibri" w:eastAsia="Calibri" w:hAnsi="Calibri"/>
+                <w:color w:val="333333"/>
+                <w:sz w:val="24"/>
+                <w:szCs w:val="24"/>
+              </w:rPr>
+              <w:t xml:space="preserve">[N] Best [keyword] for [audience] ([proof])</w:t>
+            </w:r>
+          </w:p>
+        </w:tc>
+        <w:tc>
+          <w:tcPr>
+            <w:tcW w:type="dxa" w:w="1800"/>
+          </w:tcPr>
+          <w:p>
+            <w:r>
+              <w:rPr>
+                <w:rFonts w:ascii="Calibri" w:cs="Calibri" w:eastAsia="Calibri" w:hAnsi="Calibri"/>
+                <w:color w:val="333333"/>
+                <w:sz w:val="24"/>
+                <w:szCs w:val="24"/>
+              </w:rPr>
+              <w:t xml:space="preserve">12 Best AI Writing Tools for Bloggers (Tested)</w:t>
+            </w:r>
+          </w:p>
+        </w:tc>
+      </w:tr>
+      <w:tr>
+        <w:tc>
+          <w:tcPr>
+            <w:tcW w:type="dxa" w:w="1800"/>
+          </w:tcPr>
+          <w:p>
+            <w:r>
+              <w:rPr>
+                <w:rFonts w:ascii="Calibri" w:cs="Calibri" w:eastAsia="Calibri" w:hAnsi="Calibri"/>
+                <w:color w:val="333333"/>
+                <w:sz w:val="24"/>
+                <w:szCs w:val="24"/>
+              </w:rPr>
+              <w:t xml:space="preserve">Choose between two</w:t>
+            </w:r>
+          </w:p>
+        </w:tc>
+        <w:tc>
+          <w:tcPr>
+            <w:tcW w:type="dxa" w:w="1800"/>
+          </w:tcPr>
+          <w:p>
+            <w:r>
+              <w:rPr>
+                <w:rFonts w:ascii="Calibri" w:cs="Calibri" w:eastAsia="Calibri" w:hAnsi="Calibri"/>
+                <w:color w:val="333333"/>
+                <w:sz w:val="24"/>
+                <w:szCs w:val="24"/>
+              </w:rPr>
+              <w:t xml:space="preserve">[X] vs [Y]: Which Is Better for [goal]?</w:t>
+            </w:r>
+          </w:p>
+        </w:tc>
+        <w:tc>
+          <w:tcPr>
+            <w:tcW w:type="dxa" w:w="1800"/>
+          </w:tcPr>
+          <w:p>
+            <w:r>
+              <w:rPr>
+                <w:rFonts w:ascii="Calibri" w:cs="Calibri" w:eastAsia="Calibri" w:hAnsi="Calibri"/>
+                <w:color w:val="333333"/>
+                <w:sz w:val="24"/>
+                <w:szCs w:val="24"/>
+              </w:rPr>
+              <w:t xml:space="preserve">Claude vs ChatGPT: Which Is Better for Blog Posts?</w:t>
+            </w:r>
+          </w:p>
+        </w:tc>
+      </w:tr>
+      <w:tr>
+        <w:tc>
+          <w:tcPr>
+            <w:tcW w:type="dxa" w:w="1800"/>
+          </w:tcPr>
+          <w:p>
+            <w:r>
+              <w:rPr>
+                <w:rFonts w:ascii="Calibri" w:cs="Calibri" w:eastAsia="Calibri" w:hAnsi="Calibri"/>
+                <w:color w:val="333333"/>
+                <w:sz w:val="24"/>
+                <w:szCs w:val="24"/>
+              </w:rPr>
+              <w:t xml:space="preserve">Understand a concept</w:t>
+            </w:r>
+          </w:p>
+        </w:tc>
+        <w:tc>
+          <w:tcPr>
+            <w:tcW w:type="dxa" w:w="1800"/>
+          </w:tcPr>
+          <w:p>
+            <w:r>
+              <w:rPr>
+                <w:rFonts w:ascii="Calibri" w:cs="Calibri" w:eastAsia="Calibri" w:hAnsi="Calibri"/>
+                <w:color w:val="333333"/>
+                <w:sz w:val="24"/>
+                <w:szCs w:val="24"/>
+              </w:rPr>
+              <w:t xml:space="preserve">What Is [keyword]? [benefit] Explained</w:t>
+            </w:r>
+          </w:p>
+        </w:tc>
+        <w:tc>
+          <w:tcPr>
+            <w:tcW w:type="dxa" w:w="1800"/>
+          </w:tcPr>
+          <w:p>
+            <w:r>
+              <w:rPr>
+                <w:rFonts w:ascii="Calibri" w:cs="Calibri" w:eastAsia="Calibri" w:hAnsi="Calibri"/>
+                <w:color w:val="333333"/>
+                <w:sz w:val="24"/>
+                <w:szCs w:val="24"/>
+              </w:rPr>
+              <w:t xml:space="preserve">What Is Search Intent? The 3 Cs Explained</w:t>
+            </w:r>
+          </w:p>
+        </w:tc>
+      </w:tr>
+      <w:tr>
+        <w:tc>
+          <w:tcPr>
+            <w:tcW w:type="dxa" w:w="1800"/>
+          </w:tcPr>
+          <w:p>
+            <w:r>
+              <w:rPr>
+                <w:rFonts w:ascii="Calibri" w:cs="Calibri" w:eastAsia="Calibri" w:hAnsi="Calibri"/>
+                <w:color w:val="333333"/>
+                <w:sz w:val="24"/>
+                <w:szCs w:val="24"/>
+              </w:rPr>
+              <w:t xml:space="preserve">Get ideas or examples</w:t>
+            </w:r>
+          </w:p>
+        </w:tc>
+        <w:tc>
+          <w:tcPr>
+            <w:tcW w:type="dxa" w:w="1800"/>
+          </w:tcPr>
+          <w:p>
+            <w:r>
+              <w:rPr>
+                <w:rFonts w:ascii="Calibri" w:cs="Calibri" w:eastAsia="Calibri" w:hAnsi="Calibri"/>
+                <w:color w:val="333333"/>
+                <w:sz w:val="24"/>
+                <w:szCs w:val="24"/>
+              </w:rPr>
+              <w:t xml:space="preserve">[N] [keyword] Examples That [result]</w:t>
+            </w:r>
+          </w:p>
+        </w:tc>
+        <w:tc>
+          <w:tcPr>
+            <w:tcW w:type="dxa" w:w="1800"/>
+          </w:tcPr>
+          <w:p>
+            <w:r>
+              <w:rPr>
+                <w:rFonts w:ascii="Calibri" w:cs="Calibri" w:eastAsia="Calibri" w:hAnsi="Calibri"/>
+                <w:color w:val="333333"/>
+                <w:sz w:val="24"/>
+                <w:szCs w:val="24"/>
+              </w:rPr>
+              <w:t xml:space="preserve">25 Blog Title Examples That Earned Page-One Clicks</w:t>
+            </w:r>
+          </w:p>
+        </w:tc>
+      </w:tr>
+    </w:tbl>
+    <w:p/>
+    <w:p>
+      <w:pPr>
+        <w:spacing w:after="160"/>
+      </w:pPr>
+      <w:r>
+        <w:rPr>
+          <w:rFonts w:ascii="Calibri" w:cs="Calibri" w:eastAsia="Calibri" w:hAnsi="Calibri"/>
+          <w:color w:val="333333"/>
+          <w:sz w:val="24"/>
+          <w:szCs w:val="24"/>
+        </w:rPr>
+        <w:t xml:space="preserve">Only one line in that table ends in a question mark, and it's the one where the searcher is asking a question. That fits the data above: questions don't lift CTR by themselves, so use them when the query itself is a question.</w:t>
+      </w:r>
+    </w:p>
+    <w:p>
+      <w:pPr>
+        <w:spacing w:after="160"/>
+      </w:pPr>
+      <w:r>
+        <w:rPr>
+          <w:rFonts w:ascii="Calibri" w:cs="Calibri" w:eastAsia="Calibri" w:hAnsi="Calibri"/>
+          <w:color w:val="333333"/>
+          <w:sz w:val="24"/>
+          <w:szCs w:val="24"/>
+        </w:rPr>
+        <w:t xml:space="preserve">Keep a swipe file, a habit </w:t>
+      </w:r>
+      <w:hyperlink w:history="1" r:id="rIdr-e1j6kqs-ibyutfbizg5">
+        <w:r>
+          <w:rPr>
+            <w:rStyle w:val="Hyperlink"/>
+            <w:rFonts w:ascii="Calibri" w:cs="Calibri" w:eastAsia="Calibri" w:hAnsi="Calibri"/>
+            <w:color w:val="0563C1"/>
+            <w:sz w:val="24"/>
+            <w:szCs w:val="24"/>
+            <w:u w:val="single"/>
+          </w:rPr>
+          <w:t xml:space="preserve">Copyblogger recommends in its headline guide</w:t>
+        </w:r>
+      </w:hyperlink>
+      <w:r>
+        <w:rPr>
+          <w:rFonts w:ascii="Calibri" w:cs="Calibri" w:eastAsia="Calibri" w:hAnsi="Calibri"/>
+          <w:color w:val="333333"/>
+          <w:sz w:val="24"/>
+          <w:szCs w:val="24"/>
+        </w:rPr>
+        <w:t xml:space="preserve">: every time a title makes you click, save it in a note with the search you typed. After a month you'll have your own formula list built from your niche, not a generic one.</w:t>
+      </w:r>
+    </w:p>
+    <w:p>
+      <w:pPr>
+        <w:spacing w:after="160"/>
+      </w:pPr>
+      <w:r>
+        <w:rPr>
+          <w:rFonts w:ascii="Calibri" w:cs="Calibri" w:eastAsia="Calibri" w:hAnsi="Calibri"/>
+          <w:color w:val="333333"/>
+          <w:sz w:val="24"/>
+          <w:szCs w:val="24"/>
+        </w:rPr>
+        <w:t xml:space="preserve">The line to hold is click-worthy, not clickbait. Every word in the formula must be true of the article. "Tested" means you tested. "Complete" means nothing important is missing.</w:t>
+      </w:r>
+    </w:p>
+    <w:p>
+      <w:pPr>
+        <w:pStyle w:val="Heading2"/>
+        <w:spacing w:after="120" w:before="300"/>
+      </w:pPr>
+      <w:r>
+        <w:rPr>
+          <w:rFonts w:ascii="Calibri" w:cs="Calibri" w:eastAsia="Calibri" w:hAnsi="Calibri"/>
+          <w:b/>
+          <w:bCs/>
+          <w:color w:val="7C3AED"/>
+          <w:sz w:val="36"/>
+          <w:szCs w:val="36"/>
+        </w:rPr>
         <w:t xml:space="preserve">What is a headline score, and should you trust it?</w:t>
       </w:r>
     </w:p>
@@ -1801,7 +2274,7 @@
           <w:sz w:val="24"/>
           <w:szCs w:val="24"/>
         </w:rPr>
-        <w:t xml:space="preserve"> focuses on engagement and impression factors for paid and social placements.</w:t>
+        <w:t xml:space="preserve"> was built for native ad headlines. It blends an engagement score and an impression score into one quality score.</w:t>
       </w:r>
     </w:p>
     <w:p>
@@ -1846,7 +2319,7 @@
         </w:rPr>
         <w:t xml:space="preserve">Benjamin Houy tested this directly. He compared the scores of these three tools with the real winners of </w:t>
       </w:r>
-      <w:hyperlink w:history="1" r:id="rIds3qvxt1nk1vmoqycdszig">
+      <w:hyperlink w:history="1" r:id="rIdozlcftvg0avsao0sjl_ot">
         <w:r>
           <w:rPr>
             <w:rStyle w:val="Hyperlink"/>
@@ -2616,16 +3089,16 @@
           <w:sz w:val="24"/>
           <w:szCs w:val="24"/>
         </w:rPr>
-        <w:t xml:space="preserve">Write ten versions.</w:t>
-      </w:r>
-      <w:r>
-        <w:rPr>
-          <w:rFonts w:ascii="Calibri" w:cs="Calibri" w:eastAsia="Calibri" w:hAnsi="Calibri"/>
-          <w:color w:val="333333"/>
-          <w:sz w:val="24"/>
-          <w:szCs w:val="24"/>
-        </w:rPr>
-        <w:t xml:space="preserve"> Start each with the keyword, add the benefit, then the specific detail. The first few will be obvious. The good one usually shows up around version six or seven.</w:t>
+        <w:t xml:space="preserve">Write ten versions after the draft.</w:t>
+      </w:r>
+      <w:r>
+        <w:rPr>
+          <w:rFonts w:ascii="Calibri" w:cs="Calibri" w:eastAsia="Calibri" w:hAnsi="Calibri"/>
+          <w:color w:val="333333"/>
+          <w:sz w:val="24"/>
+          <w:szCs w:val="24"/>
+        </w:rPr>
+        <w:t xml:space="preserve"> Start with a working title, then write the final headline once the article exists, because the content often ends up promising something sharper than you planned. Begin each version with the keyword, add the benefit, then the specific detail. The first few will be obvious. The good one usually shows up around version six or seven.</w:t>
       </w:r>
     </w:p>
     <w:p>
@@ -2709,7 +3182,7 @@
         </w:rPr>
         <w:t xml:space="preserve">AI can speed up step 3. Ask Claude or ChatGPT for ten headlines that include your keyword, stay under 60 characters and promise a specific outcome, then edit the best two by hand. Our </w:t>
       </w:r>
-      <w:hyperlink w:history="1" r:id="rIdvshjx55cd2o1sv-uor-ip">
+      <w:hyperlink w:history="1" r:id="rIdxswbjzqmj8skdk0grmfrb">
         <w:r>
           <w:rPr>
             <w:rStyle w:val="Hyperlink"/>
@@ -2777,7 +3250,7 @@
           <w:sz w:val="24"/>
           <w:szCs w:val="24"/>
         </w:rPr>
-        <w:t xml:space="preserve">They don't have to match word for word. The H1 can be longer and more conversational because it isn't truncated, while the title tag stays under 60 characters. Keep the same keyword and the same promise in both, or Google may pick the H1 as your title link anyway.</w:t>
+        <w:t xml:space="preserve">They don't have to match word for word. The H1 can be longer and more conversational because nothing cuts it off, while the title tag stays under 60 characters. Keep the same keyword and the same promise in both so readers land on what they clicked for.</w:t>
       </w:r>
     </w:p>
     <w:p>
@@ -2887,21 +3360,21 @@
           <w:sz w:val="28"/>
           <w:szCs w:val="28"/>
         </w:rPr>
-        <w:t xml:space="preserve">Can I change a blog headline after publishing?</w:t>
-      </w:r>
-    </w:p>
-    <w:p>
-      <w:pPr>
-        <w:spacing w:after="160"/>
-      </w:pPr>
-      <w:r>
-        <w:rPr>
-          <w:rFonts w:ascii="Calibri" w:cs="Calibri" w:eastAsia="Calibri" w:hAnsi="Calibri"/>
-          <w:color w:val="333333"/>
-          <w:sz w:val="24"/>
-          <w:szCs w:val="24"/>
-        </w:rPr>
-        <w:t xml:space="preserve">Yes. Editing the title tag is a normal, low-risk change, and Google shows the new version after it recrawls the page. Keep the URL slug the same, though. Changing the URL creates a new page in Google's eyes and needs a 301 redirect.</w:t>
+        <w:t xml:space="preserve">Should the URL slug change when I rewrite a headline?</w:t>
+      </w:r>
+    </w:p>
+    <w:p>
+      <w:pPr>
+        <w:spacing w:after="160"/>
+      </w:pPr>
+      <w:r>
+        <w:rPr>
+          <w:rFonts w:ascii="Calibri" w:cs="Calibri" w:eastAsia="Calibri" w:hAnsi="Calibri"/>
+          <w:color w:val="333333"/>
+          <w:sz w:val="24"/>
+          <w:szCs w:val="24"/>
+        </w:rPr>
+        <w:t xml:space="preserve">No. Keep the slug as it is. WordPress doesn't change a published post's slug when you edit the title, and changing it yourself turns the page into a new URL that needs a 301 redirect from the old one.</w:t>
       </w:r>
     </w:p>
     <w:p>
@@ -2979,7 +3452,7 @@
         </w:rPr>
         <w:t xml:space="preserve">Once the headline earns the click, the article has to keep the reader. My guide on </w:t>
       </w:r>
-      <w:hyperlink w:history="1" r:id="rIdt63x1rskaw6v8yunsuryy">
+      <w:hyperlink w:history="1" r:id="rIdnnapbro7chqt94yh6b2gu">
         <w:r>
           <w:rPr>
             <w:rStyle w:val="Hyperlink"/>
@@ -3001,7 +3474,7 @@
         </w:rPr>
         <w:t xml:space="preserve"> covers that part, and the </w:t>
       </w:r>
-      <w:hyperlink w:history="1" r:id="rId2qlknfl4i5nso_uwndots">
+      <w:hyperlink w:history="1" r:id="rId7_2v2ddu0uczmgtcxuj3q">
         <w:r>
           <w:rPr>
             <w:rStyle w:val="Hyperlink"/>
@@ -3023,7 +3496,7 @@
         </w:rPr>
         <w:t xml:space="preserve"> shows the full process from idea to publish. If you're choosing a writing assistant, start with our </w:t>
       </w:r>
-      <w:hyperlink w:history="1" r:id="rIddxjau639r-no5or800h67">
+      <w:hyperlink w:history="1" r:id="rIdn4r5hvloe1o6rbtqxowk1">
         <w:r>
           <w:rPr>
             <w:rStyle w:val="Hyperlink"/>

</xml_diff>